<commit_message>
Atualização das histórias de usuário
</commit_message>
<xml_diff>
--- a/1.Requisitos/Casos de Uso/BRA - Historia de Usuario - UC 03.docx
+++ b/1.Requisitos/Casos de Uso/BRA - Historia de Usuario - UC 03.docx
@@ -323,27 +323,7 @@
                 <w:color w:val="auto"/>
                 <w:lang w:val="pt-BR"/>
               </w:rPr>
-              <w:t>Execução com sucesso da carga de dados via Scraper (</w:t>
-            </w:r>
-            <w:proofErr w:type="spellStart"/>
-            <w:r>
-              <w:rPr>
-                <w:i w:val="0"/>
-                <w:iCs/>
-                <w:color w:val="auto"/>
-                <w:lang w:val="pt-BR"/>
-              </w:rPr>
-              <w:t>fbrefdata</w:t>
-            </w:r>
-            <w:proofErr w:type="spellEnd"/>
-            <w:r>
-              <w:rPr>
-                <w:i w:val="0"/>
-                <w:iCs/>
-                <w:color w:val="auto"/>
-                <w:lang w:val="pt-BR"/>
-              </w:rPr>
-              <w:t>)</w:t>
+              <w:t>Execução com sucesso da carga de dados via Scraper</w:t>
             </w:r>
           </w:p>
         </w:tc>
@@ -368,19 +348,8 @@
                 <w:color w:val="auto"/>
                 <w:lang w:val="pt-BR"/>
               </w:rPr>
-              <w:t xml:space="preserve">Disparo agendado do </w:t>
+              <w:t>Disparo agendado do Scheduler</w:t>
             </w:r>
-            <w:proofErr w:type="spellStart"/>
-            <w:r>
-              <w:rPr>
-                <w:i w:val="0"/>
-                <w:iCs/>
-                <w:color w:val="auto"/>
-                <w:lang w:val="pt-BR"/>
-              </w:rPr>
-              <w:t>Scheduler</w:t>
-            </w:r>
-            <w:proofErr w:type="spellEnd"/>
           </w:p>
         </w:tc>
         <w:tc>
@@ -513,6 +482,15 @@
                 <w:color w:val="auto"/>
                 <w:lang w:val="pt-BR"/>
               </w:rPr>
+              <w:t xml:space="preserve"> no terminal</w:t>
+            </w:r>
+            <w:r>
+              <w:rPr>
+                <w:i w:val="0"/>
+                <w:iCs/>
+                <w:color w:val="auto"/>
+                <w:lang w:val="pt-BR"/>
+              </w:rPr>
               <w:t>.</w:t>
             </w:r>
           </w:p>
@@ -632,10 +610,7 @@
             </w:sdtPr>
             <w:sdtContent>
               <w:r>
-                <w:t xml:space="preserve">BRA </w:t>
-              </w:r>
-              <w:r>
-                <w:t>- Brasileirão Analyst</w:t>
+                <w:t>BRA - Brasileirão Analyst</w:t>
               </w:r>
             </w:sdtContent>
           </w:sdt>
@@ -746,13 +721,8 @@
     <w:pPr>
       <w:jc w:val="right"/>
     </w:pPr>
-    <w:proofErr w:type="spellStart"/>
     <w:r>
-      <w:t>vs</w:t>
-    </w:r>
-    <w:proofErr w:type="spellEnd"/>
-    <w:r>
-      <w:t xml:space="preserve">: </w:t>
+      <w:t xml:space="preserve">vs: </w:t>
     </w:r>
     <w:fldSimple w:instr=" DOCPROPERTY  &quot;Versão Modelo&quot;  \* MERGEFORMAT ">
       <w:r>
@@ -2282,6 +2252,7 @@
   <w:style w:type="character" w:default="1" w:styleId="Fontepargpadro">
     <w:name w:val="Default Paragraph Font"/>
     <w:uiPriority w:val="1"/>
+    <w:semiHidden/>
     <w:unhideWhenUsed/>
   </w:style>
   <w:style w:type="table" w:default="1" w:styleId="Tabelanormal">
@@ -3245,6 +3216,7 @@
     <w:sig w:usb0="E0002EFF" w:usb1="C000785B" w:usb2="00000009" w:usb3="00000000" w:csb0="000001FF" w:csb1="00000000"/>
   </w:font>
   <w:font w:name="MS Mincho">
+    <w:altName w:val="ＭＳ 明朝"/>
     <w:panose1 w:val="02020609040205080304"/>
     <w:charset w:val="80"/>
     <w:family w:val="modern"/>
@@ -3252,7 +3224,6 @@
     <w:sig w:usb0="E00002FF" w:usb1="6AC7FDFB" w:usb2="08000012" w:usb3="00000000" w:csb0="0002009F" w:csb1="00000000"/>
   </w:font>
   <w:font w:name="Arial Unicode MS">
-    <w:altName w:val="Arial"/>
     <w:panose1 w:val="020B0604020202020204"/>
     <w:charset w:val="00"/>
     <w:family w:val="roman"/>
@@ -3328,7 +3299,9 @@
     <w:rsid w:val="008D63E5"/>
     <w:rsid w:val="00BD177B"/>
     <w:rsid w:val="00BF1DDF"/>
+    <w:rsid w:val="00C42FB9"/>
     <w:rsid w:val="00CA2E80"/>
+    <w:rsid w:val="00D3475B"/>
     <w:rsid w:val="00F81A44"/>
     <w:rsid w:val="00FA4A32"/>
   </w:rsids>

</xml_diff>